<commit_message>
Quick Update 2026-04-13 21:27
</commit_message>
<xml_diff>
--- a/data/jobs/00051_d7c3a912/generated/cover.docx
+++ b/data/jobs/00051_d7c3a912/generated/cover.docx
@@ -32,7 +32,7 @@
           <w:rFonts w:ascii="Arial" w:hAnsi="Arial"/>
           <w:sz w:val="22"/>
         </w:rPr>
-        <w:t>Date</w:t>
+        <w:t>April 13, 2026</w:t>
         <w:br/>
         <w:br/>
       </w:r>
@@ -61,7 +61,7 @@
           <w:rFonts w:ascii="Arial" w:hAnsi="Arial"/>
           <w:sz w:val="22"/>
         </w:rPr>
-        <w:t>In my most recent role as Senior Capacity &amp; Data Engineer at Citi (2017–2025), I built and maintained API connectors that ingested P95 telemetry from more than 6,000 enterprise endpoints — pulling from BMC TrueSight, TSCO, and AppDynamics APIs — and delivering that data reliably into Oracle and AWS data stores. I designed and owned the full ETL/ELT stack: Python and PySpark pipelines for ingestion and transformation, automated data quality validation rules, robust logging and error handling, and a hybrid AWS lakehouse platform (S3 landing zone, AWS Glue for transformation, Redshift and Athena for analytics). Every pipeline I built was production-grade — monitored, documented, and built to fail safely.</w:t>
+        <w:t>In my most recent role as Senior Data Engineer at Citi (2017–2025), I built and maintained API connectors that ingested P95 telemetry from more than 6,000 enterprise endpoints — pulling from BMC TrueSight, TSCO, and AppDynamics APIs — and delivering that data reliably into Oracle and AWS data stores. I designed and owned the full ETL/ELT stack: Python and PySpark pipelines for ingestion and transformation, automated data quality validation rules, robust logging and error handling, and a hybrid AWS lakehouse platform (S3 landing zone, AWS Glue for transformation, Redshift and Athena for analytics). Every pipeline I built was production-grade — monitored, documented, and built to fail safely.</w:t>
       </w:r>
     </w:p>
     <w:p>

</xml_diff>